<commit_message>
feat(courseware): align Lumina Copilot labs and visual workflow
</commit_message>
<xml_diff>
--- a/activities/lab-02-draft-a-project-brief-in-word/Lumina-Living-Project-Brief-Template.docx
+++ b/activities/lab-02-draft-a-project-brief-in-word/Lumina-Living-Project-Brief-Template.docx
@@ -4,42 +4,15 @@
   <w:body>
     <w:p>
       <w:pPr>
-        <w:jc w:val="center"/>
+        <w:pStyle w:val="Title"/>
       </w:pPr>
       <w:r>
-        <w:rPr>
-          <w:rFonts w:ascii="Arial" w:hAnsi="Arial"/>
-          <w:b/>
-          <w:color w:val="1F6FEB"/>
-          <w:sz w:val="24"/>
-        </w:rPr>
-        <w:t>LUMINA LIVING PTE LTD</w:t>
-      </w:r>
-    </w:p>
-    <w:p>
-      <w:pPr>
-        <w:jc w:val="center"/>
-      </w:pPr>
-      <w:r>
-        <w:rPr>
-          <w:rFonts w:ascii="Arial" w:hAnsi="Arial"/>
-          <w:b/>
-          <w:sz w:val="48"/>
-        </w:rPr>
-        <w:t>Sustainable Workspace Campaign Project Brief</w:t>
-      </w:r>
-    </w:p>
-    <w:p>
-      <w:pPr>
-        <w:jc w:val="center"/>
-      </w:pPr>
-      <w:r>
-        <w:t>Synthetic training artifact · Sustainable Workspace campaign</w:t>
+        <w:t>Lumina Living project brief</w:t>
       </w:r>
     </w:p>
     <w:p>
       <w:r>
-        <w:br w:type="page"/>
+        <w:t>Lumina Living Pte Ltd | SW-2026 Sustainable Workspace Launch | Synthetic training material | v8.2</w:t>
       </w:r>
     </w:p>
     <w:p>
@@ -47,12 +20,12 @@
         <w:pStyle w:val="Heading1"/>
       </w:pPr>
       <w:r>
-        <w:t>Executive Summary</w:t>
+        <w:t>Project decision</w:t>
       </w:r>
     </w:p>
     <w:p>
       <w:r>
-        <w:t>Replace with a verified 120-word summary.</w:t>
+        <w:t>Leadership must decide whether the Sustainable Workspace campaign is ready to launch on 1 October 2026. Use January–June 2026 simulated trading history for analysis; the October targets are plans, not historical results.</w:t>
       </w:r>
     </w:p>
     <w:p>
@@ -60,12 +33,12 @@
         <w:pStyle w:val="Heading1"/>
       </w:pPr>
       <w:r>
-        <w:t>Objectives and Scope</w:t>
+        <w:t>Departments and owners</w:t>
       </w:r>
     </w:p>
     <w:p>
       <w:r>
-        <w:t>Use the Campaign_Register workbook as the source.</w:t>
+        <w:t>Aisha Tan leads HR and staff enablement; Daniel Lim leads Marketing and campaign copy; Mei Chen leads Finance and checks calculations; Harish Rao leads Operations and service routing. These are fictional roles, not real message recipients.</w:t>
       </w:r>
     </w:p>
     <w:p>
@@ -73,17 +46,43 @@
         <w:pStyle w:val="Heading1"/>
       </w:pPr>
       <w:r>
-        <w:t>Milestones, Risks and Decisions</w:t>
+        <w:t>Shared targets</w:t>
       </w:r>
     </w:p>
     <w:p>
       <w:r>
-        <w:t>Mark missing evidence as [TO CONFIRM].</w:t>
+        <w:t>The campaign budget is SGD 18,000. The October target is 120 qualified business enquiries. Marketing review is due 23 September, staff training 24 September, and release review 25 September 2026.</w:t>
+      </w:r>
+    </w:p>
+    <w:p>
+      <w:pPr>
+        <w:pStyle w:val="Heading1"/>
+      </w:pPr>
+      <w:r>
+        <w:t>Source authority</w:t>
+      </w:r>
+    </w:p>
+    <w:p>
+      <w:r>
+        <w:t>Lumina-HR-Facts.docx governs staff enablement rules. Lumina-Business-Data.xlsx contains historical synthetic records and readiness counts. Lumina-Campaign-Brief.docx governs campaign scope and claims. Lumina-Travel-and-Expenses.docx and Lumina-Service-Routing.docx govern the existing agents. Never treat an illustrative completed output as a new authority.</w:t>
+      </w:r>
+    </w:p>
+    <w:p>
+      <w:pPr>
+        <w:pStyle w:val="Heading1"/>
+      </w:pPr>
+      <w:r>
+        <w:t>Delivery chain</w:t>
+      </w:r>
+    </w:p>
+    <w:p>
+      <w:r>
+        <w:t>HR facts → Word HR policy. Excel data → verified charts → Word management report → PowerPoint decision deck → Outlook draft → reviewed Teams update → Loop tasks. The same project ID and source version follow every handoff.</w:t>
       </w:r>
     </w:p>
     <w:sectPr>
       <w:pgSz w:w="12240" w:h="15840"/>
-      <w:pgMar w:top="1008" w:right="1152" w:bottom="1008" w:left="1152" w:header="720" w:footer="720" w:gutter="0"/>
+      <w:pgMar w:top="936" w:right="1080" w:bottom="936" w:left="1080" w:header="720" w:footer="720" w:gutter="0"/>
       <w:cols w:space="720"/>
       <w:docGrid w:linePitch="360"/>
     </w:sectPr>
@@ -454,6 +453,13 @@
     <w:name w:val="Normal"/>
     <w:qFormat/>
     <w:rsid w:val="00FC693F"/>
+    <w:pPr>
+      <w:spacing w:after="120"/>
+    </w:pPr>
+    <w:rPr>
+      <w:rFonts w:ascii="Arial" w:hAnsi="Arial"/>
+      <w:sz w:val="20"/>
+    </w:rPr>
   </w:style>
   <w:style w:type="paragraph" w:styleId="Header">
     <w:name w:val="header"/>
@@ -517,7 +523,7 @@
       <w:rFonts w:asciiTheme="majorHAnsi" w:eastAsiaTheme="majorEastAsia" w:hAnsiTheme="majorHAnsi" w:cstheme="majorBidi"/>
       <w:b/>
       <w:bCs/>
-      <w:color w:val="365F91" w:themeColor="accent1" w:themeShade="BF"/>
+      <w:color w:val="000000"/>
       <w:sz w:val="28"/>
       <w:szCs w:val="28"/>
     </w:rPr>
@@ -541,7 +547,7 @@
       <w:rFonts w:asciiTheme="majorHAnsi" w:eastAsiaTheme="majorEastAsia" w:hAnsiTheme="majorHAnsi" w:cstheme="majorBidi"/>
       <w:b/>
       <w:bCs/>
-      <w:color w:val="4F81BD" w:themeColor="accent1"/>
+      <w:color w:val="000000"/>
       <w:sz w:val="26"/>
       <w:szCs w:val="26"/>
     </w:rPr>
@@ -804,7 +810,7 @@
     </w:pPr>
     <w:rPr>
       <w:rFonts w:asciiTheme="majorHAnsi" w:eastAsiaTheme="majorEastAsia" w:hAnsiTheme="majorHAnsi" w:cstheme="majorBidi"/>
-      <w:color w:val="17365D" w:themeColor="text2" w:themeShade="BF"/>
+      <w:color w:val="000000"/>
       <w:spacing w:val="5"/>
       <w:kern w:val="28"/>
       <w:sz w:val="52"/>

</xml_diff>